<commit_message>
Verify the guards, do not assume them
The container document called the guard the step that makes the boundary
structural rather than procedural. Running the installer was itself
procedural, and on this machine it was not done - the desktop guard was
never installed and Claude Desktop launched with case material mounted.

Both documents now say to confirm with case-status, which reports each
guard rather than reporting the mount and assuming the rest.
</commit_message>
<xml_diff>
--- a/03-encrypted-case-container.docx
+++ b/03-encrypted-case-container.docx
@@ -2511,6 +2511,28 @@
     </w:p>
     <w:p>
       <w:pPr>
+        <w:spacing w:after="120" w:line="264"/>
+      </w:pPr>
+      <w:r>
+        <w:rPr>
+          <w:rFonts w:ascii="Calibri" w:hAnsi="Calibri"/>
+          <w:b/>
+          <w:color w:val="1A1A1A"/>
+          <w:sz w:val="21"/>
+        </w:rPr>
+        <w:t>Confirm both guards are installed, rather than assuming it.</w:t>
+      </w:r>
+      <w:r>
+        <w:rPr>
+          <w:rFonts w:ascii="Calibri" w:hAnsi="Calibri"/>
+          <w:color w:val="1A1A1A"/>
+          <w:sz w:val="21"/>
+        </w:rPr>
+        <w:t xml:space="preserve"> case-status now reports each one, and both must read installed. This exists because the assumption failed: the wrapper makes the boundary structural instead of remembered, but running the installer was itself remembered, and on this machine it was not done. The terminal guard was in place, the desktop guard was never installed, and Claude Desktop launched with the container mounted. Every document said the boundary was closed; nothing checked.</w:t>
+      </w:r>
+    </w:p>
+    <w:p>
+      <w:pPr>
         <w:pStyle w:val="Heading2"/>
         <w:spacing w:after="130" w:before="250"/>
       </w:pPr>

</xml_diff>